<commit_message>
fix: Fix Word document criteria table level column to show correct A/AA values
- Modified docx route to automatically detect template row criterion code and name
- Replaced hardcoded "1.1.1" search with dynamic detection from template
- Fixed level column replacement to use correct XML structure (<w:t>A</w:t>)
- Changed table search to find correct table using "Voldoet" marker
- Added Excel export route for findings with proper level mapping
- Added backup of Word template and gitignore for temp_docx folder

This fixes the issue where all criteria showed the same name and level.

🤖 Generated with [Claude Code](https://claude.com/claude-code)

Co-Authored-By: Claude <noreply@anthropic.com>
</commit_message>
<xml_diff>
--- a/templates/formulieren/rapport-WCAG_2.2_AA_-_Deelonderzoek_content_formulieren_-_wierden.nl-v1 (1).docx
+++ b/templates/formulieren/rapport-WCAG_2.2_AA_-_Deelonderzoek_content_formulieren_-_wierden.nl-v1 (1).docx
@@ -6829,7 +6829,7 @@
       <w:pPr>
         <w:pStyle w:val="Normal"/>
       </w:pPr>
-      <w:hyperlink r:id="rId23">
+      <w:hyperlink r:id="rId26">
         <w:r>
           <w:rPr>
             <w:rStyle w:val="Hyperlink"/>
@@ -6842,7 +6842,7 @@
       <w:pPr>
         <w:pStyle w:val="Normal"/>
       </w:pPr>
-      <w:hyperlink r:id="rId23">
+      <w:hyperlink r:id="rId27">
         <w:r>
           <w:rPr>
             <w:rStyle w:val="Hyperlink"/>

</xml_diff>